<commit_message>
Added sequence diagrams and tests
</commit_message>
<xml_diff>
--- a/documentation/blackjack.docx
+++ b/documentation/blackjack.docx
@@ -84,11 +84,7 @@
       </w:pPr>
       <w:r>
         <w:rPr>
-          <w:rFonts w:ascii="Times New Roman" w:hAnsi="Times New Roman"/>
-          <w:b w:val="false"/>
-          <w:bCs w:val="false"/>
-          <w:sz w:val="24"/>
-          <w:szCs w:val="24"/>
+          <w:b/>
         </w:rPr>
       </w:r>
     </w:p>
@@ -358,6 +354,7 @@
       <w:pgNumType w:fmt="decimal"/>
       <w:formProt w:val="false"/>
       <w:textDirection w:val="lrTb"/>
+      <w:docGrid w:type="default" w:linePitch="100" w:charSpace="0"/>
     </w:sectPr>
   </w:body>
 </w:document>
@@ -513,7 +510,6 @@
     </w:lvl>
     <w:lvl w:ilvl="2">
       <w:start w:val="1"/>
-      <w:pStyle w:val="Heading3"/>
       <w:numFmt w:val="none"/>
       <w:suff w:val="nothing"/>
       <w:lvlText w:val=""/>
@@ -627,7 +623,6 @@
     </w:rPrDefault>
     <w:pPrDefault>
       <w:pPr>
-        <w:widowControl/>
         <w:suppressAutoHyphens w:val="true"/>
       </w:pPr>
     </w:pPrDefault>
@@ -637,7 +632,10 @@
     <w:qFormat/>
     <w:pPr>
       <w:widowControl/>
+      <w:suppressAutoHyphens w:val="true"/>
       <w:bidi w:val="0"/>
+      <w:spacing w:before="0" w:after="0"/>
+      <w:jc w:val="start"/>
     </w:pPr>
     <w:rPr>
       <w:rFonts w:ascii="Liberation Serif" w:hAnsi="Liberation Serif" w:eastAsia="Noto Serif CJK SC" w:cs="Noto Sans Devanagari"/>

</xml_diff>